<commit_message>
change in use case
</commit_message>
<xml_diff>
--- a/documentation.docx
+++ b/documentation.docx
@@ -1,6 +1,6 @@
 
 <file path=word/document.xml><?xml version="1.0" encoding="utf-8"?>
-<w:document xmlns:wpc="http://schemas.microsoft.com/office/word/2010/wordprocessingCanvas" xmlns:mc="http://schemas.openxmlformats.org/markup-compatibility/2006" xmlns:o="urn:schemas-microsoft-com:office:office" xmlns:r="http://schemas.openxmlformats.org/officeDocument/2006/relationships" xmlns:m="http://schemas.openxmlformats.org/officeDocument/2006/math" xmlns:v="urn:schemas-microsoft-com:vml" xmlns:wp14="http://schemas.microsoft.com/office/word/2010/wordprocessingDrawing" xmlns:wp="http://schemas.openxmlformats.org/drawingml/2006/wordprocessingDrawing" xmlns:w10="urn:schemas-microsoft-com:office:word" xmlns:w="http://schemas.openxmlformats.org/wordprocessingml/2006/main" xmlns:w14="http://schemas.microsoft.com/office/word/2010/wordml" xmlns:w15="http://schemas.microsoft.com/office/word/2012/wordml" xmlns:wpg="http://schemas.microsoft.com/office/word/2010/wordprocessingGroup" xmlns:wpi="http://schemas.microsoft.com/office/word/2010/wordprocessingInk" xmlns:wne="http://schemas.microsoft.com/office/word/2006/wordml" xmlns:wps="http://schemas.microsoft.com/office/word/2010/wordprocessingShape" mc:Ignorable="w14 w15 wp14">
+<w:document xmlns:wpc="http://schemas.microsoft.com/office/word/2010/wordprocessingCanvas" xmlns:cx="http://schemas.microsoft.com/office/drawing/2014/chartex" xmlns:cx1="http://schemas.microsoft.com/office/drawing/2015/9/8/chartex" xmlns:cx2="http://schemas.microsoft.com/office/drawing/2015/10/21/chartex" xmlns:cx3="http://schemas.microsoft.com/office/drawing/2016/5/9/chartex" xmlns:cx4="http://schemas.microsoft.com/office/drawing/2016/5/10/chartex" xmlns:cx5="http://schemas.microsoft.com/office/drawing/2016/5/11/chartex" xmlns:cx6="http://schemas.microsoft.com/office/drawing/2016/5/12/chartex" xmlns:cx7="http://schemas.microsoft.com/office/drawing/2016/5/13/chartex" xmlns:cx8="http://schemas.microsoft.com/office/drawing/2016/5/14/chartex" xmlns:mc="http://schemas.openxmlformats.org/markup-compatibility/2006" xmlns:aink="http://schemas.microsoft.com/office/drawing/2016/ink" xmlns:am3d="http://schemas.microsoft.com/office/drawing/2017/model3d" xmlns:o="urn:schemas-microsoft-com:office:office" xmlns:oel="http://schemas.microsoft.com/office/2019/extlst" xmlns:r="http://schemas.openxmlformats.org/officeDocument/2006/relationships" xmlns:m="http://schemas.openxmlformats.org/officeDocument/2006/math" xmlns:v="urn:schemas-microsoft-com:vml" xmlns:wp14="http://schemas.microsoft.com/office/word/2010/wordprocessingDrawing" xmlns:wp="http://schemas.openxmlformats.org/drawingml/2006/wordprocessingDrawing" xmlns:w10="urn:schemas-microsoft-com:office:word" xmlns:w="http://schemas.openxmlformats.org/wordprocessingml/2006/main" xmlns:w14="http://schemas.microsoft.com/office/word/2010/wordml" xmlns:w15="http://schemas.microsoft.com/office/word/2012/wordml" xmlns:w16cex="http://schemas.microsoft.com/office/word/2018/wordml/cex" xmlns:w16cid="http://schemas.microsoft.com/office/word/2016/wordml/cid" xmlns:w16="http://schemas.microsoft.com/office/word/2018/wordml" xmlns:w16du="http://schemas.microsoft.com/office/word/2023/wordml/word16du" xmlns:w16sdtdh="http://schemas.microsoft.com/office/word/2020/wordml/sdtdatahash" xmlns:w16sdtfl="http://schemas.microsoft.com/office/word/2024/wordml/sdtformatlock" xmlns:w16se="http://schemas.microsoft.com/office/word/2015/wordml/symex" xmlns:wpg="http://schemas.microsoft.com/office/word/2010/wordprocessingGroup" xmlns:wpi="http://schemas.microsoft.com/office/word/2010/wordprocessingInk" xmlns:wne="http://schemas.microsoft.com/office/word/2006/wordml" xmlns:wps="http://schemas.microsoft.com/office/word/2010/wordprocessingShape" mc:Ignorable="w14 w15 w16se w16cid w16 w16cex w16sdtdh w16sdtfl w16du wp14">
   <w:body>
     <w:p>
       <w:pPr>
@@ -360,7 +360,7 @@
               </wp:inline>
             </w:drawing>
           </mc:Choice>
-          <mc:Fallback xmlns:w16se="http://schemas.microsoft.com/office/word/2015/wordml/symex" xmlns:w16sdtfl="http://schemas.microsoft.com/office/word/2024/wordml/sdtformatlock" xmlns:w16sdtdh="http://schemas.microsoft.com/office/word/2020/wordml/sdtdatahash" xmlns:w16du="http://schemas.microsoft.com/office/word/2023/wordml/word16du" xmlns:w16="http://schemas.microsoft.com/office/word/2018/wordml" xmlns:w16cid="http://schemas.microsoft.com/office/word/2016/wordml/cid" xmlns:w16cex="http://schemas.microsoft.com/office/word/2018/wordml/cex" xmlns:oel="http://schemas.microsoft.com/office/2019/extlst" xmlns:am3d="http://schemas.microsoft.com/office/drawing/2017/model3d" xmlns:aink="http://schemas.microsoft.com/office/drawing/2016/ink" xmlns:cx8="http://schemas.microsoft.com/office/drawing/2016/5/14/chartex" xmlns:cx7="http://schemas.microsoft.com/office/drawing/2016/5/13/chartex" xmlns:cx6="http://schemas.microsoft.com/office/drawing/2016/5/12/chartex" xmlns:cx5="http://schemas.microsoft.com/office/drawing/2016/5/11/chartex" xmlns:cx4="http://schemas.microsoft.com/office/drawing/2016/5/10/chartex" xmlns:cx3="http://schemas.microsoft.com/office/drawing/2016/5/9/chartex" xmlns:cx2="http://schemas.microsoft.com/office/drawing/2015/10/21/chartex" xmlns:cx1="http://schemas.microsoft.com/office/drawing/2015/9/8/chartex" xmlns:cx="http://schemas.microsoft.com/office/drawing/2014/chartex">
+          <mc:Fallback>
             <w:pict>
               <v:group w14:anchorId="6686C47B" id="Group 5" o:spid="_x0000_s1026" style="width:68.5pt;height:110pt;mso-position-horizontal-relative:char;mso-position-vertical-relative:line" coordsize="6762,16097" o:gfxdata="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">
                 <v:line id="Straight Connector 2" o:spid="_x0000_s1027" style="position:absolute;visibility:visible;mso-wrap-style:square" from="3333,0" to="3333,16097" o:connectortype="straight" o:gfxdata="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" strokecolor="black [3200]" strokeweight="2.5pt">
@@ -1745,6 +1745,7 @@
           <w:sz w:val="32"/>
           <w:szCs w:val="32"/>
         </w:rPr>
+        <w:lastRenderedPageBreak/>
         <w:t>List of Figures</w:t>
       </w:r>
       <w:r>
@@ -2033,6 +2034,7 @@
       </w:pPr>
       <w:bookmarkStart w:id="3" w:name="_Toc229475138"/>
       <w:r>
+        <w:lastRenderedPageBreak/>
         <w:t>1.</w:t>
       </w:r>
       <w:r>
@@ -2155,6 +2157,7 @@
     </w:p>
     <w:p>
       <w:r>
+        <w:lastRenderedPageBreak/>
         <w:t>This project also includes additional innovative feature such as tournament mode and streak bonus system. Tournament mode allows users to compete in multiple rounds continuously, while the streak bonus system reward users for consecutive wins.</w:t>
       </w:r>
       <w:r>
@@ -2185,6 +2188,7 @@
       </w:pPr>
       <w:bookmarkStart w:id="4" w:name="_Toc229475139"/>
       <w:r>
+        <w:lastRenderedPageBreak/>
         <w:t xml:space="preserve">2. </w:t>
       </w:r>
       <w:r>
@@ -2308,6 +2312,7 @@
         <w:br w:type="page"/>
       </w:r>
       <w:r>
+        <w:lastRenderedPageBreak/>
         <w:tab/>
       </w:r>
     </w:p>
@@ -2556,6 +2561,7 @@
       </w:pPr>
       <w:bookmarkStart w:id="6" w:name="_Toc229475141"/>
       <w:r>
+        <w:lastRenderedPageBreak/>
         <w:t>4.</w:t>
       </w:r>
       <w:r>
@@ -2587,7 +2593,6 @@
           <w:numId w:val="26"/>
         </w:numPr>
       </w:pPr>
-      <w:bookmarkStart w:id="7" w:name="_GoBack"/>
       <w:r>
         <w:t>There Traditional games don’</w:t>
       </w:r>
@@ -2801,7 +2806,6 @@
         <w:t xml:space="preserve">The proposed system will improve user interaction, provide better learning opportunities, and demonstrate real-world software development concepts. </w:t>
       </w:r>
     </w:p>
-    <w:bookmarkEnd w:id="7"/>
     <w:p>
       <w:r>
         <w:br w:type="page"/>
@@ -2815,11 +2819,12 @@
           <w:numId w:val="34"/>
         </w:numPr>
       </w:pPr>
-      <w:bookmarkStart w:id="8" w:name="_Toc229475142"/>
-      <w:r>
+      <w:bookmarkStart w:id="7" w:name="_Toc229475142"/>
+      <w:r>
+        <w:lastRenderedPageBreak/>
         <w:t>High Level Requirements</w:t>
       </w:r>
-      <w:bookmarkEnd w:id="8"/>
+      <w:bookmarkEnd w:id="7"/>
     </w:p>
     <w:p>
       <w:r>
@@ -3232,6 +3237,7 @@
         <w:rPr>
           <w:b/>
         </w:rPr>
+        <w:lastRenderedPageBreak/>
         <w:t xml:space="preserve">5.3 </w:t>
       </w:r>
       <w:r>
@@ -3822,11 +3828,12 @@
           <w:numId w:val="34"/>
         </w:numPr>
       </w:pPr>
-      <w:bookmarkStart w:id="9" w:name="_Toc229475143"/>
-      <w:r>
+      <w:bookmarkStart w:id="8" w:name="_Toc229475143"/>
+      <w:r>
+        <w:lastRenderedPageBreak/>
         <w:t>System Design</w:t>
       </w:r>
-      <w:bookmarkEnd w:id="9"/>
+      <w:bookmarkEnd w:id="8"/>
       <w:r>
         <w:t xml:space="preserve"> </w:t>
       </w:r>
@@ -3846,10 +3853,10 @@
           <w:noProof/>
         </w:rPr>
         <w:drawing>
-          <wp:inline distT="0" distB="0" distL="0" distR="0" wp14:anchorId="716487B7" wp14:editId="644623D9">
-            <wp:extent cx="5280660" cy="5635256"/>
-            <wp:effectExtent l="0" t="0" r="0" b="3810"/>
-            <wp:docPr id="1" name="Picture 1"/>
+          <wp:inline distT="0" distB="0" distL="0" distR="0" wp14:anchorId="5889C1C9" wp14:editId="4315319D">
+            <wp:extent cx="5755068" cy="4556097"/>
+            <wp:effectExtent l="0" t="0" r="0" b="0"/>
+            <wp:docPr id="1093839079" name="Picture 4"/>
             <wp:cNvGraphicFramePr>
               <a:graphicFrameLocks xmlns:a="http://schemas.openxmlformats.org/drawingml/2006/main" noChangeAspect="1"/>
             </wp:cNvGraphicFramePr>
@@ -3857,7 +3864,7 @@
               <a:graphicData uri="http://schemas.openxmlformats.org/drawingml/2006/picture">
                 <pic:pic xmlns:pic="http://schemas.openxmlformats.org/drawingml/2006/picture">
                   <pic:nvPicPr>
-                    <pic:cNvPr id="1" name="WhatsApp Image 2026-05-09 at 10.03.22 PM.jpeg"/>
+                    <pic:cNvPr id="1093839079" name="Picture 1093839079"/>
                     <pic:cNvPicPr/>
                   </pic:nvPicPr>
                   <pic:blipFill>
@@ -3875,7 +3882,7 @@
                   <pic:spPr>
                     <a:xfrm>
                       <a:off x="0" y="0"/>
-                      <a:ext cx="5339952" cy="5698530"/>
+                      <a:ext cx="5781803" cy="4577262"/>
                     </a:xfrm>
                     <a:prstGeom prst="rect">
                       <a:avLst/>
@@ -3899,7 +3906,7 @@
           <w:szCs w:val="24"/>
         </w:rPr>
       </w:pPr>
-      <w:bookmarkStart w:id="10" w:name="_Toc229479371"/>
+      <w:bookmarkStart w:id="9" w:name="_Toc229479371"/>
       <w:r>
         <w:rPr>
           <w:i w:val="0"/>
@@ -3946,7 +3953,7 @@
         </w:rPr>
         <w:t>1</w:t>
       </w:r>
-      <w:bookmarkEnd w:id="10"/>
+      <w:bookmarkEnd w:id="9"/>
       <w:r>
         <w:rPr>
           <w:i w:val="0"/>
@@ -3974,6 +3981,12 @@
         </w:rPr>
       </w:pPr>
     </w:p>
+    <w:p/>
+    <w:p/>
+    <w:p/>
+    <w:p/>
+    <w:p/>
+    <w:p/>
     <w:p>
       <w:pPr>
         <w:pStyle w:val="Caption"/>
@@ -3996,24 +4009,6 @@
         </w:rPr>
         <w:tab/>
       </w:r>
-    </w:p>
-    <w:p>
-      <w:pPr>
-        <w:rPr>
-          <w:iCs/>
-          <w:sz w:val="18"/>
-          <w:szCs w:val="18"/>
-        </w:rPr>
-      </w:pPr>
-    </w:p>
-    <w:p>
-      <w:pPr>
-        <w:rPr>
-          <w:iCs/>
-          <w:sz w:val="18"/>
-          <w:szCs w:val="18"/>
-        </w:rPr>
-      </w:pPr>
     </w:p>
     <w:p>
       <w:pPr>
@@ -4023,11 +4018,12 @@
           <w:numId w:val="34"/>
         </w:numPr>
       </w:pPr>
-      <w:bookmarkStart w:id="11" w:name="_Toc229475144"/>
-      <w:r>
+      <w:bookmarkStart w:id="10" w:name="_Toc229475144"/>
+      <w:r>
+        <w:lastRenderedPageBreak/>
         <w:t>Detailed Timeline</w:t>
       </w:r>
-      <w:bookmarkEnd w:id="11"/>
+      <w:bookmarkEnd w:id="10"/>
     </w:p>
     <w:p>
       <w:r>
@@ -4186,7 +4182,7 @@
           <w:szCs w:val="24"/>
         </w:rPr>
       </w:pPr>
-      <w:bookmarkStart w:id="12" w:name="_Toc229479372"/>
+      <w:bookmarkStart w:id="11" w:name="_Toc229479372"/>
       <w:r>
         <w:rPr>
           <w:i w:val="0"/>
@@ -4233,7 +4229,7 @@
         </w:rPr>
         <w:t>2</w:t>
       </w:r>
-      <w:bookmarkEnd w:id="12"/>
+      <w:bookmarkEnd w:id="11"/>
       <w:r>
         <w:rPr>
           <w:i w:val="0"/>
@@ -4260,6 +4256,7 @@
         <w:rPr>
           <w:b/>
         </w:rPr>
+        <w:lastRenderedPageBreak/>
         <w:t>Ga</w:t>
       </w:r>
       <w:r>
@@ -4345,7 +4342,7 @@
           <w:szCs w:val="24"/>
         </w:rPr>
       </w:pPr>
-      <w:bookmarkStart w:id="13" w:name="_Toc229479373"/>
+      <w:bookmarkStart w:id="12" w:name="_Toc229479373"/>
       <w:r>
         <w:rPr>
           <w:i w:val="0"/>
@@ -4392,7 +4389,7 @@
         </w:rPr>
         <w:t>3</w:t>
       </w:r>
-      <w:bookmarkEnd w:id="13"/>
+      <w:bookmarkEnd w:id="12"/>
       <w:r>
         <w:rPr>
           <w:i w:val="0"/>
@@ -4441,11 +4438,12 @@
           <w:numId w:val="34"/>
         </w:numPr>
       </w:pPr>
-      <w:bookmarkStart w:id="14" w:name="_Toc229475145"/>
-      <w:r>
+      <w:bookmarkStart w:id="13" w:name="_Toc229475145"/>
+      <w:r>
+        <w:lastRenderedPageBreak/>
         <w:t>Conclusion</w:t>
       </w:r>
-      <w:bookmarkEnd w:id="14"/>
+      <w:bookmarkEnd w:id="13"/>
     </w:p>
     <w:p>
       <w:r>
@@ -4490,11 +4488,12 @@
           <w:numId w:val="34"/>
         </w:numPr>
       </w:pPr>
-      <w:bookmarkStart w:id="15" w:name="_Toc229475146"/>
-      <w:r>
+      <w:bookmarkStart w:id="14" w:name="_Toc229475146"/>
+      <w:r>
+        <w:lastRenderedPageBreak/>
         <w:t>Reference</w:t>
       </w:r>
-      <w:bookmarkEnd w:id="15"/>
+      <w:bookmarkEnd w:id="14"/>
     </w:p>
     <w:p>
       <w:r>
@@ -4549,7 +4548,7 @@
 </file>
 
 <file path=word/endnotes.xml><?xml version="1.0" encoding="utf-8"?>
-<w:endnotes xmlns:wpc="http://schemas.microsoft.com/office/word/2010/wordprocessingCanvas" xmlns:mc="http://schemas.openxmlformats.org/markup-compatibility/2006" xmlns:o="urn:schemas-microsoft-com:office:office" xmlns:r="http://schemas.openxmlformats.org/officeDocument/2006/relationships" xmlns:m="http://schemas.openxmlformats.org/officeDocument/2006/math" xmlns:v="urn:schemas-microsoft-com:vml" xmlns:wp14="http://schemas.microsoft.com/office/word/2010/wordprocessingDrawing" xmlns:wp="http://schemas.openxmlformats.org/drawingml/2006/wordprocessingDrawing" xmlns:w10="urn:schemas-microsoft-com:office:word" xmlns:w="http://schemas.openxmlformats.org/wordprocessingml/2006/main" xmlns:w14="http://schemas.microsoft.com/office/word/2010/wordml" xmlns:w15="http://schemas.microsoft.com/office/word/2012/wordml" xmlns:wpg="http://schemas.microsoft.com/office/word/2010/wordprocessingGroup" xmlns:wpi="http://schemas.microsoft.com/office/word/2010/wordprocessingInk" xmlns:wne="http://schemas.microsoft.com/office/word/2006/wordml" xmlns:wps="http://schemas.microsoft.com/office/word/2010/wordprocessingShape" mc:Ignorable="w14 w15 wp14">
+<w:endnotes xmlns:wpc="http://schemas.microsoft.com/office/word/2010/wordprocessingCanvas" xmlns:cx="http://schemas.microsoft.com/office/drawing/2014/chartex" xmlns:cx1="http://schemas.microsoft.com/office/drawing/2015/9/8/chartex" xmlns:cx2="http://schemas.microsoft.com/office/drawing/2015/10/21/chartex" xmlns:cx3="http://schemas.microsoft.com/office/drawing/2016/5/9/chartex" xmlns:cx4="http://schemas.microsoft.com/office/drawing/2016/5/10/chartex" xmlns:cx5="http://schemas.microsoft.com/office/drawing/2016/5/11/chartex" xmlns:cx6="http://schemas.microsoft.com/office/drawing/2016/5/12/chartex" xmlns:cx7="http://schemas.microsoft.com/office/drawing/2016/5/13/chartex" xmlns:cx8="http://schemas.microsoft.com/office/drawing/2016/5/14/chartex" xmlns:mc="http://schemas.openxmlformats.org/markup-compatibility/2006" xmlns:aink="http://schemas.microsoft.com/office/drawing/2016/ink" xmlns:am3d="http://schemas.microsoft.com/office/drawing/2017/model3d" xmlns:o="urn:schemas-microsoft-com:office:office" xmlns:oel="http://schemas.microsoft.com/office/2019/extlst" xmlns:r="http://schemas.openxmlformats.org/officeDocument/2006/relationships" xmlns:m="http://schemas.openxmlformats.org/officeDocument/2006/math" xmlns:v="urn:schemas-microsoft-com:vml" xmlns:wp14="http://schemas.microsoft.com/office/word/2010/wordprocessingDrawing" xmlns:wp="http://schemas.openxmlformats.org/drawingml/2006/wordprocessingDrawing" xmlns:w10="urn:schemas-microsoft-com:office:word" xmlns:w="http://schemas.openxmlformats.org/wordprocessingml/2006/main" xmlns:w14="http://schemas.microsoft.com/office/word/2010/wordml" xmlns:w15="http://schemas.microsoft.com/office/word/2012/wordml" xmlns:w16cex="http://schemas.microsoft.com/office/word/2018/wordml/cex" xmlns:w16cid="http://schemas.microsoft.com/office/word/2016/wordml/cid" xmlns:w16="http://schemas.microsoft.com/office/word/2018/wordml" xmlns:w16du="http://schemas.microsoft.com/office/word/2023/wordml/word16du" xmlns:w16sdtdh="http://schemas.microsoft.com/office/word/2020/wordml/sdtdatahash" xmlns:w16sdtfl="http://schemas.microsoft.com/office/word/2024/wordml/sdtformatlock" xmlns:w16se="http://schemas.microsoft.com/office/word/2015/wordml/symex" xmlns:wpg="http://schemas.microsoft.com/office/word/2010/wordprocessingGroup" xmlns:wpi="http://schemas.microsoft.com/office/word/2010/wordprocessingInk" xmlns:wne="http://schemas.microsoft.com/office/word/2006/wordml" xmlns:wps="http://schemas.microsoft.com/office/word/2010/wordprocessingShape" mc:Ignorable="w14 w15 w16se w16cid w16 w16cex w16sdtdh w16sdtfl w16du wp14">
   <w:endnote w:type="separator" w:id="-1">
     <w:p>
       <w:pPr>
@@ -4574,7 +4573,7 @@
 </file>
 
 <file path=word/footer1.xml><?xml version="1.0" encoding="utf-8"?>
-<w:ftr xmlns:wpc="http://schemas.microsoft.com/office/word/2010/wordprocessingCanvas" xmlns:mc="http://schemas.openxmlformats.org/markup-compatibility/2006" xmlns:o="urn:schemas-microsoft-com:office:office" xmlns:r="http://schemas.openxmlformats.org/officeDocument/2006/relationships" xmlns:m="http://schemas.openxmlformats.org/officeDocument/2006/math" xmlns:v="urn:schemas-microsoft-com:vml" xmlns:wp14="http://schemas.microsoft.com/office/word/2010/wordprocessingDrawing" xmlns:wp="http://schemas.openxmlformats.org/drawingml/2006/wordprocessingDrawing" xmlns:w10="urn:schemas-microsoft-com:office:word" xmlns:w="http://schemas.openxmlformats.org/wordprocessingml/2006/main" xmlns:w14="http://schemas.microsoft.com/office/word/2010/wordml" xmlns:w15="http://schemas.microsoft.com/office/word/2012/wordml" xmlns:wpg="http://schemas.microsoft.com/office/word/2010/wordprocessingGroup" xmlns:wpi="http://schemas.microsoft.com/office/word/2010/wordprocessingInk" xmlns:wne="http://schemas.microsoft.com/office/word/2006/wordml" xmlns:wps="http://schemas.microsoft.com/office/word/2010/wordprocessingShape" mc:Ignorable="w14 w15 wp14">
+<w:ftr xmlns:wpc="http://schemas.microsoft.com/office/word/2010/wordprocessingCanvas" xmlns:cx="http://schemas.microsoft.com/office/drawing/2014/chartex" xmlns:cx1="http://schemas.microsoft.com/office/drawing/2015/9/8/chartex" xmlns:cx2="http://schemas.microsoft.com/office/drawing/2015/10/21/chartex" xmlns:cx3="http://schemas.microsoft.com/office/drawing/2016/5/9/chartex" xmlns:cx4="http://schemas.microsoft.com/office/drawing/2016/5/10/chartex" xmlns:cx5="http://schemas.microsoft.com/office/drawing/2016/5/11/chartex" xmlns:cx6="http://schemas.microsoft.com/office/drawing/2016/5/12/chartex" xmlns:cx7="http://schemas.microsoft.com/office/drawing/2016/5/13/chartex" xmlns:cx8="http://schemas.microsoft.com/office/drawing/2016/5/14/chartex" xmlns:mc="http://schemas.openxmlformats.org/markup-compatibility/2006" xmlns:aink="http://schemas.microsoft.com/office/drawing/2016/ink" xmlns:am3d="http://schemas.microsoft.com/office/drawing/2017/model3d" xmlns:o="urn:schemas-microsoft-com:office:office" xmlns:oel="http://schemas.microsoft.com/office/2019/extlst" xmlns:r="http://schemas.openxmlformats.org/officeDocument/2006/relationships" xmlns:m="http://schemas.openxmlformats.org/officeDocument/2006/math" xmlns:v="urn:schemas-microsoft-com:vml" xmlns:wp14="http://schemas.microsoft.com/office/word/2010/wordprocessingDrawing" xmlns:wp="http://schemas.openxmlformats.org/drawingml/2006/wordprocessingDrawing" xmlns:w10="urn:schemas-microsoft-com:office:word" xmlns:w="http://schemas.openxmlformats.org/wordprocessingml/2006/main" xmlns:w14="http://schemas.microsoft.com/office/word/2010/wordml" xmlns:w15="http://schemas.microsoft.com/office/word/2012/wordml" xmlns:w16cex="http://schemas.microsoft.com/office/word/2018/wordml/cex" xmlns:w16cid="http://schemas.microsoft.com/office/word/2016/wordml/cid" xmlns:w16="http://schemas.microsoft.com/office/word/2018/wordml" xmlns:w16du="http://schemas.microsoft.com/office/word/2023/wordml/word16du" xmlns:w16sdtdh="http://schemas.microsoft.com/office/word/2020/wordml/sdtdatahash" xmlns:w16sdtfl="http://schemas.microsoft.com/office/word/2024/wordml/sdtformatlock" xmlns:w16se="http://schemas.microsoft.com/office/word/2015/wordml/symex" xmlns:wpg="http://schemas.microsoft.com/office/word/2010/wordprocessingGroup" xmlns:wpi="http://schemas.microsoft.com/office/word/2010/wordprocessingInk" xmlns:wne="http://schemas.microsoft.com/office/word/2006/wordml" xmlns:wps="http://schemas.microsoft.com/office/word/2010/wordprocessingShape" mc:Ignorable="w14 w15 w16se w16cid w16 w16cex w16sdtdh w16sdtfl w16du wp14">
   <w:sdt>
     <w:sdtPr>
       <w:id w:val="44963995"/>
@@ -4627,7 +4626,7 @@
 </file>
 
 <file path=word/footer2.xml><?xml version="1.0" encoding="utf-8"?>
-<w:ftr xmlns:wpc="http://schemas.microsoft.com/office/word/2010/wordprocessingCanvas" xmlns:mc="http://schemas.openxmlformats.org/markup-compatibility/2006" xmlns:o="urn:schemas-microsoft-com:office:office" xmlns:r="http://schemas.openxmlformats.org/officeDocument/2006/relationships" xmlns:m="http://schemas.openxmlformats.org/officeDocument/2006/math" xmlns:v="urn:schemas-microsoft-com:vml" xmlns:wp14="http://schemas.microsoft.com/office/word/2010/wordprocessingDrawing" xmlns:wp="http://schemas.openxmlformats.org/drawingml/2006/wordprocessingDrawing" xmlns:w10="urn:schemas-microsoft-com:office:word" xmlns:w="http://schemas.openxmlformats.org/wordprocessingml/2006/main" xmlns:w14="http://schemas.microsoft.com/office/word/2010/wordml" xmlns:w15="http://schemas.microsoft.com/office/word/2012/wordml" xmlns:wpg="http://schemas.microsoft.com/office/word/2010/wordprocessingGroup" xmlns:wpi="http://schemas.microsoft.com/office/word/2010/wordprocessingInk" xmlns:wne="http://schemas.microsoft.com/office/word/2006/wordml" xmlns:wps="http://schemas.microsoft.com/office/word/2010/wordprocessingShape" mc:Ignorable="w14 w15 wp14">
+<w:ftr xmlns:wpc="http://schemas.microsoft.com/office/word/2010/wordprocessingCanvas" xmlns:cx="http://schemas.microsoft.com/office/drawing/2014/chartex" xmlns:cx1="http://schemas.microsoft.com/office/drawing/2015/9/8/chartex" xmlns:cx2="http://schemas.microsoft.com/office/drawing/2015/10/21/chartex" xmlns:cx3="http://schemas.microsoft.com/office/drawing/2016/5/9/chartex" xmlns:cx4="http://schemas.microsoft.com/office/drawing/2016/5/10/chartex" xmlns:cx5="http://schemas.microsoft.com/office/drawing/2016/5/11/chartex" xmlns:cx6="http://schemas.microsoft.com/office/drawing/2016/5/12/chartex" xmlns:cx7="http://schemas.microsoft.com/office/drawing/2016/5/13/chartex" xmlns:cx8="http://schemas.microsoft.com/office/drawing/2016/5/14/chartex" xmlns:mc="http://schemas.openxmlformats.org/markup-compatibility/2006" xmlns:aink="http://schemas.microsoft.com/office/drawing/2016/ink" xmlns:am3d="http://schemas.microsoft.com/office/drawing/2017/model3d" xmlns:o="urn:schemas-microsoft-com:office:office" xmlns:oel="http://schemas.microsoft.com/office/2019/extlst" xmlns:r="http://schemas.openxmlformats.org/officeDocument/2006/relationships" xmlns:m="http://schemas.openxmlformats.org/officeDocument/2006/math" xmlns:v="urn:schemas-microsoft-com:vml" xmlns:wp14="http://schemas.microsoft.com/office/word/2010/wordprocessingDrawing" xmlns:wp="http://schemas.openxmlformats.org/drawingml/2006/wordprocessingDrawing" xmlns:w10="urn:schemas-microsoft-com:office:word" xmlns:w="http://schemas.openxmlformats.org/wordprocessingml/2006/main" xmlns:w14="http://schemas.microsoft.com/office/word/2010/wordml" xmlns:w15="http://schemas.microsoft.com/office/word/2012/wordml" xmlns:w16cex="http://schemas.microsoft.com/office/word/2018/wordml/cex" xmlns:w16cid="http://schemas.microsoft.com/office/word/2016/wordml/cid" xmlns:w16="http://schemas.microsoft.com/office/word/2018/wordml" xmlns:w16du="http://schemas.microsoft.com/office/word/2023/wordml/word16du" xmlns:w16sdtdh="http://schemas.microsoft.com/office/word/2020/wordml/sdtdatahash" xmlns:w16sdtfl="http://schemas.microsoft.com/office/word/2024/wordml/sdtformatlock" xmlns:w16se="http://schemas.microsoft.com/office/word/2015/wordml/symex" xmlns:wpg="http://schemas.microsoft.com/office/word/2010/wordprocessingGroup" xmlns:wpi="http://schemas.microsoft.com/office/word/2010/wordprocessingInk" xmlns:wne="http://schemas.microsoft.com/office/word/2006/wordml" xmlns:wps="http://schemas.microsoft.com/office/word/2010/wordprocessingShape" mc:Ignorable="w14 w15 w16se w16cid w16 w16cex w16sdtdh w16sdtfl w16du wp14">
   <w:sdt>
     <w:sdtPr>
       <w:id w:val="1493303353"/>
@@ -4680,7 +4679,7 @@
 </file>
 
 <file path=word/footnotes.xml><?xml version="1.0" encoding="utf-8"?>
-<w:footnotes xmlns:wpc="http://schemas.microsoft.com/office/word/2010/wordprocessingCanvas" xmlns:mc="http://schemas.openxmlformats.org/markup-compatibility/2006" xmlns:o="urn:schemas-microsoft-com:office:office" xmlns:r="http://schemas.openxmlformats.org/officeDocument/2006/relationships" xmlns:m="http://schemas.openxmlformats.org/officeDocument/2006/math" xmlns:v="urn:schemas-microsoft-com:vml" xmlns:wp14="http://schemas.microsoft.com/office/word/2010/wordprocessingDrawing" xmlns:wp="http://schemas.openxmlformats.org/drawingml/2006/wordprocessingDrawing" xmlns:w10="urn:schemas-microsoft-com:office:word" xmlns:w="http://schemas.openxmlformats.org/wordprocessingml/2006/main" xmlns:w14="http://schemas.microsoft.com/office/word/2010/wordml" xmlns:w15="http://schemas.microsoft.com/office/word/2012/wordml" xmlns:wpg="http://schemas.microsoft.com/office/word/2010/wordprocessingGroup" xmlns:wpi="http://schemas.microsoft.com/office/word/2010/wordprocessingInk" xmlns:wne="http://schemas.microsoft.com/office/word/2006/wordml" xmlns:wps="http://schemas.microsoft.com/office/word/2010/wordprocessingShape" mc:Ignorable="w14 w15 wp14">
+<w:footnotes xmlns:wpc="http://schemas.microsoft.com/office/word/2010/wordprocessingCanvas" xmlns:cx="http://schemas.microsoft.com/office/drawing/2014/chartex" xmlns:cx1="http://schemas.microsoft.com/office/drawing/2015/9/8/chartex" xmlns:cx2="http://schemas.microsoft.com/office/drawing/2015/10/21/chartex" xmlns:cx3="http://schemas.microsoft.com/office/drawing/2016/5/9/chartex" xmlns:cx4="http://schemas.microsoft.com/office/drawing/2016/5/10/chartex" xmlns:cx5="http://schemas.microsoft.com/office/drawing/2016/5/11/chartex" xmlns:cx6="http://schemas.microsoft.com/office/drawing/2016/5/12/chartex" xmlns:cx7="http://schemas.microsoft.com/office/drawing/2016/5/13/chartex" xmlns:cx8="http://schemas.microsoft.com/office/drawing/2016/5/14/chartex" xmlns:mc="http://schemas.openxmlformats.org/markup-compatibility/2006" xmlns:aink="http://schemas.microsoft.com/office/drawing/2016/ink" xmlns:am3d="http://schemas.microsoft.com/office/drawing/2017/model3d" xmlns:o="urn:schemas-microsoft-com:office:office" xmlns:oel="http://schemas.microsoft.com/office/2019/extlst" xmlns:r="http://schemas.openxmlformats.org/officeDocument/2006/relationships" xmlns:m="http://schemas.openxmlformats.org/officeDocument/2006/math" xmlns:v="urn:schemas-microsoft-com:vml" xmlns:wp14="http://schemas.microsoft.com/office/word/2010/wordprocessingDrawing" xmlns:wp="http://schemas.openxmlformats.org/drawingml/2006/wordprocessingDrawing" xmlns:w10="urn:schemas-microsoft-com:office:word" xmlns:w="http://schemas.openxmlformats.org/wordprocessingml/2006/main" xmlns:w14="http://schemas.microsoft.com/office/word/2010/wordml" xmlns:w15="http://schemas.microsoft.com/office/word/2012/wordml" xmlns:w16cex="http://schemas.microsoft.com/office/word/2018/wordml/cex" xmlns:w16cid="http://schemas.microsoft.com/office/word/2016/wordml/cid" xmlns:w16="http://schemas.microsoft.com/office/word/2018/wordml" xmlns:w16du="http://schemas.microsoft.com/office/word/2023/wordml/word16du" xmlns:w16sdtdh="http://schemas.microsoft.com/office/word/2020/wordml/sdtdatahash" xmlns:w16sdtfl="http://schemas.microsoft.com/office/word/2024/wordml/sdtformatlock" xmlns:w16se="http://schemas.microsoft.com/office/word/2015/wordml/symex" xmlns:wpg="http://schemas.microsoft.com/office/word/2010/wordprocessingGroup" xmlns:wpi="http://schemas.microsoft.com/office/word/2010/wordprocessingInk" xmlns:wne="http://schemas.microsoft.com/office/word/2006/wordml" xmlns:wps="http://schemas.microsoft.com/office/word/2010/wordprocessingShape" mc:Ignorable="w14 w15 w16se w16cid w16 w16cex w16sdtdh w16sdtfl w16du wp14">
   <w:footnote w:type="separator" w:id="-1">
     <w:p>
       <w:pPr>
@@ -4705,7 +4704,7 @@
 </file>
 
 <file path=word/header1.xml><?xml version="1.0" encoding="utf-8"?>
-<w:hdr xmlns:wpc="http://schemas.microsoft.com/office/word/2010/wordprocessingCanvas" xmlns:mc="http://schemas.openxmlformats.org/markup-compatibility/2006" xmlns:o="urn:schemas-microsoft-com:office:office" xmlns:r="http://schemas.openxmlformats.org/officeDocument/2006/relationships" xmlns:m="http://schemas.openxmlformats.org/officeDocument/2006/math" xmlns:v="urn:schemas-microsoft-com:vml" xmlns:wp14="http://schemas.microsoft.com/office/word/2010/wordprocessingDrawing" xmlns:wp="http://schemas.openxmlformats.org/drawingml/2006/wordprocessingDrawing" xmlns:w10="urn:schemas-microsoft-com:office:word" xmlns:w="http://schemas.openxmlformats.org/wordprocessingml/2006/main" xmlns:w14="http://schemas.microsoft.com/office/word/2010/wordml" xmlns:w15="http://schemas.microsoft.com/office/word/2012/wordml" xmlns:wpg="http://schemas.microsoft.com/office/word/2010/wordprocessingGroup" xmlns:wpi="http://schemas.microsoft.com/office/word/2010/wordprocessingInk" xmlns:wne="http://schemas.microsoft.com/office/word/2006/wordml" xmlns:wps="http://schemas.microsoft.com/office/word/2010/wordprocessingShape" mc:Ignorable="w14 w15 wp14">
+<w:hdr xmlns:wpc="http://schemas.microsoft.com/office/word/2010/wordprocessingCanvas" xmlns:cx="http://schemas.microsoft.com/office/drawing/2014/chartex" xmlns:cx1="http://schemas.microsoft.com/office/drawing/2015/9/8/chartex" xmlns:cx2="http://schemas.microsoft.com/office/drawing/2015/10/21/chartex" xmlns:cx3="http://schemas.microsoft.com/office/drawing/2016/5/9/chartex" xmlns:cx4="http://schemas.microsoft.com/office/drawing/2016/5/10/chartex" xmlns:cx5="http://schemas.microsoft.com/office/drawing/2016/5/11/chartex" xmlns:cx6="http://schemas.microsoft.com/office/drawing/2016/5/12/chartex" xmlns:cx7="http://schemas.microsoft.com/office/drawing/2016/5/13/chartex" xmlns:cx8="http://schemas.microsoft.com/office/drawing/2016/5/14/chartex" xmlns:mc="http://schemas.openxmlformats.org/markup-compatibility/2006" xmlns:aink="http://schemas.microsoft.com/office/drawing/2016/ink" xmlns:am3d="http://schemas.microsoft.com/office/drawing/2017/model3d" xmlns:o="urn:schemas-microsoft-com:office:office" xmlns:oel="http://schemas.microsoft.com/office/2019/extlst" xmlns:r="http://schemas.openxmlformats.org/officeDocument/2006/relationships" xmlns:m="http://schemas.openxmlformats.org/officeDocument/2006/math" xmlns:v="urn:schemas-microsoft-com:vml" xmlns:wp14="http://schemas.microsoft.com/office/word/2010/wordprocessingDrawing" xmlns:wp="http://schemas.openxmlformats.org/drawingml/2006/wordprocessingDrawing" xmlns:w10="urn:schemas-microsoft-com:office:word" xmlns:w="http://schemas.openxmlformats.org/wordprocessingml/2006/main" xmlns:w14="http://schemas.microsoft.com/office/word/2010/wordml" xmlns:w15="http://schemas.microsoft.com/office/word/2012/wordml" xmlns:w16cex="http://schemas.microsoft.com/office/word/2018/wordml/cex" xmlns:w16cid="http://schemas.microsoft.com/office/word/2016/wordml/cid" xmlns:w16="http://schemas.microsoft.com/office/word/2018/wordml" xmlns:w16du="http://schemas.microsoft.com/office/word/2023/wordml/word16du" xmlns:w16sdtdh="http://schemas.microsoft.com/office/word/2020/wordml/sdtdatahash" xmlns:w16sdtfl="http://schemas.microsoft.com/office/word/2024/wordml/sdtformatlock" xmlns:w16se="http://schemas.microsoft.com/office/word/2015/wordml/symex" xmlns:wpg="http://schemas.microsoft.com/office/word/2010/wordprocessingGroup" xmlns:wpi="http://schemas.microsoft.com/office/word/2010/wordprocessingInk" xmlns:wne="http://schemas.microsoft.com/office/word/2006/wordml" xmlns:wps="http://schemas.microsoft.com/office/word/2010/wordprocessingShape" mc:Ignorable="w14 w15 w16se w16cid w16 w16cex w16sdtdh w16sdtfl w16du wp14">
   <w:p>
     <w:pPr>
       <w:pStyle w:val="Header"/>
@@ -4723,7 +4722,7 @@
 </file>
 
 <file path=word/header2.xml><?xml version="1.0" encoding="utf-8"?>
-<w:hdr xmlns:wpc="http://schemas.microsoft.com/office/word/2010/wordprocessingCanvas" xmlns:mc="http://schemas.openxmlformats.org/markup-compatibility/2006" xmlns:o="urn:schemas-microsoft-com:office:office" xmlns:r="http://schemas.openxmlformats.org/officeDocument/2006/relationships" xmlns:m="http://schemas.openxmlformats.org/officeDocument/2006/math" xmlns:v="urn:schemas-microsoft-com:vml" xmlns:wp14="http://schemas.microsoft.com/office/word/2010/wordprocessingDrawing" xmlns:wp="http://schemas.openxmlformats.org/drawingml/2006/wordprocessingDrawing" xmlns:w10="urn:schemas-microsoft-com:office:word" xmlns:w="http://schemas.openxmlformats.org/wordprocessingml/2006/main" xmlns:w14="http://schemas.microsoft.com/office/word/2010/wordml" xmlns:w15="http://schemas.microsoft.com/office/word/2012/wordml" xmlns:wpg="http://schemas.microsoft.com/office/word/2010/wordprocessingGroup" xmlns:wpi="http://schemas.microsoft.com/office/word/2010/wordprocessingInk" xmlns:wne="http://schemas.microsoft.com/office/word/2006/wordml" xmlns:wps="http://schemas.microsoft.com/office/word/2010/wordprocessingShape" mc:Ignorable="w14 w15 wp14">
+<w:hdr xmlns:wpc="http://schemas.microsoft.com/office/word/2010/wordprocessingCanvas" xmlns:cx="http://schemas.microsoft.com/office/drawing/2014/chartex" xmlns:cx1="http://schemas.microsoft.com/office/drawing/2015/9/8/chartex" xmlns:cx2="http://schemas.microsoft.com/office/drawing/2015/10/21/chartex" xmlns:cx3="http://schemas.microsoft.com/office/drawing/2016/5/9/chartex" xmlns:cx4="http://schemas.microsoft.com/office/drawing/2016/5/10/chartex" xmlns:cx5="http://schemas.microsoft.com/office/drawing/2016/5/11/chartex" xmlns:cx6="http://schemas.microsoft.com/office/drawing/2016/5/12/chartex" xmlns:cx7="http://schemas.microsoft.com/office/drawing/2016/5/13/chartex" xmlns:cx8="http://schemas.microsoft.com/office/drawing/2016/5/14/chartex" xmlns:mc="http://schemas.openxmlformats.org/markup-compatibility/2006" xmlns:aink="http://schemas.microsoft.com/office/drawing/2016/ink" xmlns:am3d="http://schemas.microsoft.com/office/drawing/2017/model3d" xmlns:o="urn:schemas-microsoft-com:office:office" xmlns:oel="http://schemas.microsoft.com/office/2019/extlst" xmlns:r="http://schemas.openxmlformats.org/officeDocument/2006/relationships" xmlns:m="http://schemas.openxmlformats.org/officeDocument/2006/math" xmlns:v="urn:schemas-microsoft-com:vml" xmlns:wp14="http://schemas.microsoft.com/office/word/2010/wordprocessingDrawing" xmlns:wp="http://schemas.openxmlformats.org/drawingml/2006/wordprocessingDrawing" xmlns:w10="urn:schemas-microsoft-com:office:word" xmlns:w="http://schemas.openxmlformats.org/wordprocessingml/2006/main" xmlns:w14="http://schemas.microsoft.com/office/word/2010/wordml" xmlns:w15="http://schemas.microsoft.com/office/word/2012/wordml" xmlns:w16cex="http://schemas.microsoft.com/office/word/2018/wordml/cex" xmlns:w16cid="http://schemas.microsoft.com/office/word/2016/wordml/cid" xmlns:w16="http://schemas.microsoft.com/office/word/2018/wordml" xmlns:w16du="http://schemas.microsoft.com/office/word/2023/wordml/word16du" xmlns:w16sdtdh="http://schemas.microsoft.com/office/word/2020/wordml/sdtdatahash" xmlns:w16sdtfl="http://schemas.microsoft.com/office/word/2024/wordml/sdtformatlock" xmlns:w16se="http://schemas.microsoft.com/office/word/2015/wordml/symex" xmlns:wpg="http://schemas.microsoft.com/office/word/2010/wordprocessingGroup" xmlns:wpi="http://schemas.microsoft.com/office/word/2010/wordprocessingInk" xmlns:wne="http://schemas.microsoft.com/office/word/2006/wordml" xmlns:wps="http://schemas.microsoft.com/office/word/2010/wordprocessingShape" mc:Ignorable="w14 w15 w16se w16cid w16 w16cex w16sdtdh w16sdtfl w16du wp14">
   <w:p>
     <w:pPr>
       <w:pStyle w:val="Header"/>
@@ -4741,8 +4740,8 @@
 </file>
 
 <file path=word/numbering.xml><?xml version="1.0" encoding="utf-8"?>
-<w:numbering xmlns:wpc="http://schemas.microsoft.com/office/word/2010/wordprocessingCanvas" xmlns:mc="http://schemas.openxmlformats.org/markup-compatibility/2006" xmlns:o="urn:schemas-microsoft-com:office:office" xmlns:r="http://schemas.openxmlformats.org/officeDocument/2006/relationships" xmlns:m="http://schemas.openxmlformats.org/officeDocument/2006/math" xmlns:v="urn:schemas-microsoft-com:vml" xmlns:wp14="http://schemas.microsoft.com/office/word/2010/wordprocessingDrawing" xmlns:wp="http://schemas.openxmlformats.org/drawingml/2006/wordprocessingDrawing" xmlns:w10="urn:schemas-microsoft-com:office:word" xmlns:w="http://schemas.openxmlformats.org/wordprocessingml/2006/main" xmlns:w14="http://schemas.microsoft.com/office/word/2010/wordml" xmlns:w15="http://schemas.microsoft.com/office/word/2012/wordml" xmlns:wpg="http://schemas.microsoft.com/office/word/2010/wordprocessingGroup" xmlns:wpi="http://schemas.microsoft.com/office/word/2010/wordprocessingInk" xmlns:wne="http://schemas.microsoft.com/office/word/2006/wordml" xmlns:wps="http://schemas.microsoft.com/office/word/2010/wordprocessingShape" mc:Ignorable="w14 w15 wp14">
-  <w:abstractNum w:abstractNumId="0">
+<w:numbering xmlns:wpc="http://schemas.microsoft.com/office/word/2010/wordprocessingCanvas" xmlns:cx="http://schemas.microsoft.com/office/drawing/2014/chartex" xmlns:cx1="http://schemas.microsoft.com/office/drawing/2015/9/8/chartex" xmlns:cx2="http://schemas.microsoft.com/office/drawing/2015/10/21/chartex" xmlns:cx3="http://schemas.microsoft.com/office/drawing/2016/5/9/chartex" xmlns:cx4="http://schemas.microsoft.com/office/drawing/2016/5/10/chartex" xmlns:cx5="http://schemas.microsoft.com/office/drawing/2016/5/11/chartex" xmlns:cx6="http://schemas.microsoft.com/office/drawing/2016/5/12/chartex" xmlns:cx7="http://schemas.microsoft.com/office/drawing/2016/5/13/chartex" xmlns:cx8="http://schemas.microsoft.com/office/drawing/2016/5/14/chartex" xmlns:mc="http://schemas.openxmlformats.org/markup-compatibility/2006" xmlns:aink="http://schemas.microsoft.com/office/drawing/2016/ink" xmlns:am3d="http://schemas.microsoft.com/office/drawing/2017/model3d" xmlns:o="urn:schemas-microsoft-com:office:office" xmlns:oel="http://schemas.microsoft.com/office/2019/extlst" xmlns:r="http://schemas.openxmlformats.org/officeDocument/2006/relationships" xmlns:m="http://schemas.openxmlformats.org/officeDocument/2006/math" xmlns:v="urn:schemas-microsoft-com:vml" xmlns:wp14="http://schemas.microsoft.com/office/word/2010/wordprocessingDrawing" xmlns:wp="http://schemas.openxmlformats.org/drawingml/2006/wordprocessingDrawing" xmlns:w10="urn:schemas-microsoft-com:office:word" xmlns:w="http://schemas.openxmlformats.org/wordprocessingml/2006/main" xmlns:w14="http://schemas.microsoft.com/office/word/2010/wordml" xmlns:w15="http://schemas.microsoft.com/office/word/2012/wordml" xmlns:w16cex="http://schemas.microsoft.com/office/word/2018/wordml/cex" xmlns:w16cid="http://schemas.microsoft.com/office/word/2016/wordml/cid" xmlns:w16="http://schemas.microsoft.com/office/word/2018/wordml" xmlns:w16du="http://schemas.microsoft.com/office/word/2023/wordml/word16du" xmlns:w16sdtdh="http://schemas.microsoft.com/office/word/2020/wordml/sdtdatahash" xmlns:w16sdtfl="http://schemas.microsoft.com/office/word/2024/wordml/sdtformatlock" xmlns:w16se="http://schemas.microsoft.com/office/word/2015/wordml/symex" xmlns:wpg="http://schemas.microsoft.com/office/word/2010/wordprocessingGroup" xmlns:wpi="http://schemas.microsoft.com/office/word/2010/wordprocessingInk" xmlns:wne="http://schemas.microsoft.com/office/word/2006/wordml" xmlns:wps="http://schemas.microsoft.com/office/word/2010/wordprocessingShape" mc:Ignorable="w14 w15 w16se w16cid w16 w16cex w16sdtdh w16sdtfl w16du wp14">
+  <w:abstractNum w:abstractNumId="0" w15:restartNumberingAfterBreak="0">
     <w:nsid w:val="0E022743"/>
     <w:multiLevelType w:val="hybridMultilevel"/>
     <w:tmpl w:val="FCAAA680"/>
@@ -4831,7 +4830,7 @@
       </w:pPr>
     </w:lvl>
   </w:abstractNum>
-  <w:abstractNum w:abstractNumId="1">
+  <w:abstractNum w:abstractNumId="1" w15:restartNumberingAfterBreak="0">
     <w:nsid w:val="0FA97372"/>
     <w:multiLevelType w:val="multilevel"/>
     <w:tmpl w:val="7C181842"/>
@@ -4944,7 +4943,7 @@
       </w:rPr>
     </w:lvl>
   </w:abstractNum>
-  <w:abstractNum w:abstractNumId="2">
+  <w:abstractNum w:abstractNumId="2" w15:restartNumberingAfterBreak="0">
     <w:nsid w:val="11080D9D"/>
     <w:multiLevelType w:val="multilevel"/>
     <w:tmpl w:val="DB1C7804"/>
@@ -5093,7 +5092,7 @@
       </w:rPr>
     </w:lvl>
   </w:abstractNum>
-  <w:abstractNum w:abstractNumId="3">
+  <w:abstractNum w:abstractNumId="3" w15:restartNumberingAfterBreak="0">
     <w:nsid w:val="17D61375"/>
     <w:multiLevelType w:val="hybridMultilevel"/>
     <w:tmpl w:val="3B209BBC"/>
@@ -5179,7 +5178,7 @@
       </w:pPr>
     </w:lvl>
   </w:abstractNum>
-  <w:abstractNum w:abstractNumId="4">
+  <w:abstractNum w:abstractNumId="4" w15:restartNumberingAfterBreak="0">
     <w:nsid w:val="1F5B20BF"/>
     <w:multiLevelType w:val="hybridMultilevel"/>
     <w:tmpl w:val="0B148300"/>
@@ -5265,7 +5264,7 @@
       </w:pPr>
     </w:lvl>
   </w:abstractNum>
-  <w:abstractNum w:abstractNumId="5">
+  <w:abstractNum w:abstractNumId="5" w15:restartNumberingAfterBreak="0">
     <w:nsid w:val="1FE83DE6"/>
     <w:multiLevelType w:val="hybridMultilevel"/>
     <w:tmpl w:val="7D2EB0E8"/>
@@ -5354,7 +5353,7 @@
       </w:pPr>
     </w:lvl>
   </w:abstractNum>
-  <w:abstractNum w:abstractNumId="6">
+  <w:abstractNum w:abstractNumId="6" w15:restartNumberingAfterBreak="0">
     <w:nsid w:val="230E7A72"/>
     <w:multiLevelType w:val="hybridMultilevel"/>
     <w:tmpl w:val="D14E5DB6"/>
@@ -5443,7 +5442,7 @@
       </w:pPr>
     </w:lvl>
   </w:abstractNum>
-  <w:abstractNum w:abstractNumId="7">
+  <w:abstractNum w:abstractNumId="7" w15:restartNumberingAfterBreak="0">
     <w:nsid w:val="28D53AAE"/>
     <w:multiLevelType w:val="multilevel"/>
     <w:tmpl w:val="E0D85A56"/>
@@ -5564,7 +5563,7 @@
       </w:rPr>
     </w:lvl>
   </w:abstractNum>
-  <w:abstractNum w:abstractNumId="8">
+  <w:abstractNum w:abstractNumId="8" w15:restartNumberingAfterBreak="0">
     <w:nsid w:val="2BC606F8"/>
     <w:multiLevelType w:val="hybridMultilevel"/>
     <w:tmpl w:val="02CE1BBA"/>
@@ -5653,7 +5652,7 @@
       </w:pPr>
     </w:lvl>
   </w:abstractNum>
-  <w:abstractNum w:abstractNumId="9">
+  <w:abstractNum w:abstractNumId="9" w15:restartNumberingAfterBreak="0">
     <w:nsid w:val="2BDC58A8"/>
     <w:multiLevelType w:val="hybridMultilevel"/>
     <w:tmpl w:val="6310E0A6"/>
@@ -5742,7 +5741,7 @@
       </w:pPr>
     </w:lvl>
   </w:abstractNum>
-  <w:abstractNum w:abstractNumId="10">
+  <w:abstractNum w:abstractNumId="10" w15:restartNumberingAfterBreak="0">
     <w:nsid w:val="304450E7"/>
     <w:multiLevelType w:val="hybridMultilevel"/>
     <w:tmpl w:val="179C1F3A"/>
@@ -5831,7 +5830,7 @@
       </w:pPr>
     </w:lvl>
   </w:abstractNum>
-  <w:abstractNum w:abstractNumId="11">
+  <w:abstractNum w:abstractNumId="11" w15:restartNumberingAfterBreak="0">
     <w:nsid w:val="354143F8"/>
     <w:multiLevelType w:val="hybridMultilevel"/>
     <w:tmpl w:val="80A26312"/>
@@ -5944,7 +5943,7 @@
       </w:rPr>
     </w:lvl>
   </w:abstractNum>
-  <w:abstractNum w:abstractNumId="12">
+  <w:abstractNum w:abstractNumId="12" w15:restartNumberingAfterBreak="0">
     <w:nsid w:val="37B976D2"/>
     <w:multiLevelType w:val="hybridMultilevel"/>
     <w:tmpl w:val="C686B4C6"/>
@@ -6033,7 +6032,7 @@
       </w:pPr>
     </w:lvl>
   </w:abstractNum>
-  <w:abstractNum w:abstractNumId="13">
+  <w:abstractNum w:abstractNumId="13" w15:restartNumberingAfterBreak="0">
     <w:nsid w:val="388D4174"/>
     <w:multiLevelType w:val="hybridMultilevel"/>
     <w:tmpl w:val="9A3EB2A6"/>
@@ -6146,7 +6145,7 @@
       </w:rPr>
     </w:lvl>
   </w:abstractNum>
-  <w:abstractNum w:abstractNumId="14">
+  <w:abstractNum w:abstractNumId="14" w15:restartNumberingAfterBreak="0">
     <w:nsid w:val="38990403"/>
     <w:multiLevelType w:val="hybridMultilevel"/>
     <w:tmpl w:val="21180EF4"/>
@@ -6232,7 +6231,7 @@
       </w:pPr>
     </w:lvl>
   </w:abstractNum>
-  <w:abstractNum w:abstractNumId="15">
+  <w:abstractNum w:abstractNumId="15" w15:restartNumberingAfterBreak="0">
     <w:nsid w:val="3A103230"/>
     <w:multiLevelType w:val="hybridMultilevel"/>
     <w:tmpl w:val="420E5E74"/>
@@ -6321,7 +6320,7 @@
       </w:pPr>
     </w:lvl>
   </w:abstractNum>
-  <w:abstractNum w:abstractNumId="16">
+  <w:abstractNum w:abstractNumId="16" w15:restartNumberingAfterBreak="0">
     <w:nsid w:val="3CAA7D00"/>
     <w:multiLevelType w:val="hybridMultilevel"/>
     <w:tmpl w:val="7FAE95B6"/>
@@ -6434,7 +6433,7 @@
       </w:rPr>
     </w:lvl>
   </w:abstractNum>
-  <w:abstractNum w:abstractNumId="17">
+  <w:abstractNum w:abstractNumId="17" w15:restartNumberingAfterBreak="0">
     <w:nsid w:val="3D85501A"/>
     <w:multiLevelType w:val="hybridMultilevel"/>
     <w:tmpl w:val="7ED8929C"/>
@@ -6520,7 +6519,7 @@
       </w:pPr>
     </w:lvl>
   </w:abstractNum>
-  <w:abstractNum w:abstractNumId="18">
+  <w:abstractNum w:abstractNumId="18" w15:restartNumberingAfterBreak="0">
     <w:nsid w:val="40EC6F4B"/>
     <w:multiLevelType w:val="hybridMultilevel"/>
     <w:tmpl w:val="CCFC8B78"/>
@@ -6633,7 +6632,7 @@
       </w:rPr>
     </w:lvl>
   </w:abstractNum>
-  <w:abstractNum w:abstractNumId="19">
+  <w:abstractNum w:abstractNumId="19" w15:restartNumberingAfterBreak="0">
     <w:nsid w:val="45022324"/>
     <w:multiLevelType w:val="hybridMultilevel"/>
     <w:tmpl w:val="FD901576"/>
@@ -6722,7 +6721,7 @@
       </w:pPr>
     </w:lvl>
   </w:abstractNum>
-  <w:abstractNum w:abstractNumId="20">
+  <w:abstractNum w:abstractNumId="20" w15:restartNumberingAfterBreak="0">
     <w:nsid w:val="4B1B07B0"/>
     <w:multiLevelType w:val="hybridMultilevel"/>
     <w:tmpl w:val="3A787C90"/>
@@ -6811,7 +6810,7 @@
       </w:pPr>
     </w:lvl>
   </w:abstractNum>
-  <w:abstractNum w:abstractNumId="21">
+  <w:abstractNum w:abstractNumId="21" w15:restartNumberingAfterBreak="0">
     <w:nsid w:val="4ECA557F"/>
     <w:multiLevelType w:val="hybridMultilevel"/>
     <w:tmpl w:val="7B76FEB8"/>
@@ -6897,7 +6896,7 @@
       </w:pPr>
     </w:lvl>
   </w:abstractNum>
-  <w:abstractNum w:abstractNumId="22">
+  <w:abstractNum w:abstractNumId="22" w15:restartNumberingAfterBreak="0">
     <w:nsid w:val="510C12AC"/>
     <w:multiLevelType w:val="hybridMultilevel"/>
     <w:tmpl w:val="1EECA868"/>
@@ -7010,7 +7009,7 @@
       </w:rPr>
     </w:lvl>
   </w:abstractNum>
-  <w:abstractNum w:abstractNumId="23">
+  <w:abstractNum w:abstractNumId="23" w15:restartNumberingAfterBreak="0">
     <w:nsid w:val="591B1F8F"/>
     <w:multiLevelType w:val="hybridMultilevel"/>
     <w:tmpl w:val="40AC74DE"/>
@@ -7099,7 +7098,7 @@
       </w:pPr>
     </w:lvl>
   </w:abstractNum>
-  <w:abstractNum w:abstractNumId="24">
+  <w:abstractNum w:abstractNumId="24" w15:restartNumberingAfterBreak="0">
     <w:nsid w:val="5BE77E95"/>
     <w:multiLevelType w:val="hybridMultilevel"/>
     <w:tmpl w:val="F244A096"/>
@@ -7185,7 +7184,7 @@
       </w:pPr>
     </w:lvl>
   </w:abstractNum>
-  <w:abstractNum w:abstractNumId="25">
+  <w:abstractNum w:abstractNumId="25" w15:restartNumberingAfterBreak="0">
     <w:nsid w:val="5CFE4A2C"/>
     <w:multiLevelType w:val="hybridMultilevel"/>
     <w:tmpl w:val="07B62302"/>
@@ -7274,7 +7273,7 @@
       </w:pPr>
     </w:lvl>
   </w:abstractNum>
-  <w:abstractNum w:abstractNumId="26">
+  <w:abstractNum w:abstractNumId="26" w15:restartNumberingAfterBreak="0">
     <w:nsid w:val="60975DAC"/>
     <w:multiLevelType w:val="hybridMultilevel"/>
     <w:tmpl w:val="6DF4AD60"/>
@@ -7364,7 +7363,7 @@
       </w:pPr>
     </w:lvl>
   </w:abstractNum>
-  <w:abstractNum w:abstractNumId="27">
+  <w:abstractNum w:abstractNumId="27" w15:restartNumberingAfterBreak="0">
     <w:nsid w:val="60B12A81"/>
     <w:multiLevelType w:val="multilevel"/>
     <w:tmpl w:val="BBE6D7CC"/>
@@ -7513,7 +7512,7 @@
       </w:rPr>
     </w:lvl>
   </w:abstractNum>
-  <w:abstractNum w:abstractNumId="28">
+  <w:abstractNum w:abstractNumId="28" w15:restartNumberingAfterBreak="0">
     <w:nsid w:val="618C13BC"/>
     <w:multiLevelType w:val="hybridMultilevel"/>
     <w:tmpl w:val="9D8A4E08"/>
@@ -7599,7 +7598,7 @@
       </w:pPr>
     </w:lvl>
   </w:abstractNum>
-  <w:abstractNum w:abstractNumId="29">
+  <w:abstractNum w:abstractNumId="29" w15:restartNumberingAfterBreak="0">
     <w:nsid w:val="672C3DC4"/>
     <w:multiLevelType w:val="multilevel"/>
     <w:tmpl w:val="7108E11E"/>
@@ -7748,7 +7747,7 @@
       </w:rPr>
     </w:lvl>
   </w:abstractNum>
-  <w:abstractNum w:abstractNumId="30">
+  <w:abstractNum w:abstractNumId="30" w15:restartNumberingAfterBreak="0">
     <w:nsid w:val="688C12F2"/>
     <w:multiLevelType w:val="hybridMultilevel"/>
     <w:tmpl w:val="F708AF3A"/>
@@ -7861,7 +7860,7 @@
       </w:rPr>
     </w:lvl>
   </w:abstractNum>
-  <w:abstractNum w:abstractNumId="31">
+  <w:abstractNum w:abstractNumId="31" w15:restartNumberingAfterBreak="0">
     <w:nsid w:val="69CA3B02"/>
     <w:multiLevelType w:val="hybridMultilevel"/>
     <w:tmpl w:val="F642E598"/>
@@ -7974,7 +7973,7 @@
       </w:rPr>
     </w:lvl>
   </w:abstractNum>
-  <w:abstractNum w:abstractNumId="32">
+  <w:abstractNum w:abstractNumId="32" w15:restartNumberingAfterBreak="0">
     <w:nsid w:val="72BA1947"/>
     <w:multiLevelType w:val="hybridMultilevel"/>
     <w:tmpl w:val="CCE4C876"/>
@@ -8087,7 +8086,7 @@
       </w:rPr>
     </w:lvl>
   </w:abstractNum>
-  <w:abstractNum w:abstractNumId="33">
+  <w:abstractNum w:abstractNumId="33" w15:restartNumberingAfterBreak="0">
     <w:nsid w:val="7A3B0902"/>
     <w:multiLevelType w:val="hybridMultilevel"/>
     <w:tmpl w:val="8F7AAA36"/>
@@ -8200,113 +8199,113 @@
       </w:rPr>
     </w:lvl>
   </w:abstractNum>
-  <w:num w:numId="1">
+  <w:num w:numId="1" w16cid:durableId="660549039">
     <w:abstractNumId w:val="10"/>
   </w:num>
-  <w:num w:numId="2">
+  <w:num w:numId="2" w16cid:durableId="198589338">
     <w:abstractNumId w:val="26"/>
   </w:num>
-  <w:num w:numId="3">
+  <w:num w:numId="3" w16cid:durableId="2010019898">
     <w:abstractNumId w:val="11"/>
   </w:num>
-  <w:num w:numId="4">
+  <w:num w:numId="4" w16cid:durableId="49771247">
     <w:abstractNumId w:val="22"/>
   </w:num>
-  <w:num w:numId="5">
+  <w:num w:numId="5" w16cid:durableId="964119704">
     <w:abstractNumId w:val="27"/>
   </w:num>
-  <w:num w:numId="6">
+  <w:num w:numId="6" w16cid:durableId="2085056744">
     <w:abstractNumId w:val="31"/>
   </w:num>
-  <w:num w:numId="7">
+  <w:num w:numId="7" w16cid:durableId="423770246">
     <w:abstractNumId w:val="12"/>
   </w:num>
-  <w:num w:numId="8">
+  <w:num w:numId="8" w16cid:durableId="1436748551">
     <w:abstractNumId w:val="4"/>
   </w:num>
-  <w:num w:numId="9">
+  <w:num w:numId="9" w16cid:durableId="1172527200">
     <w:abstractNumId w:val="18"/>
   </w:num>
-  <w:num w:numId="10">
+  <w:num w:numId="10" w16cid:durableId="1270969260">
     <w:abstractNumId w:val="1"/>
   </w:num>
-  <w:num w:numId="11">
+  <w:num w:numId="11" w16cid:durableId="1699237981">
     <w:abstractNumId w:val="15"/>
   </w:num>
-  <w:num w:numId="12">
+  <w:num w:numId="12" w16cid:durableId="913735100">
     <w:abstractNumId w:val="25"/>
   </w:num>
-  <w:num w:numId="13">
+  <w:num w:numId="13" w16cid:durableId="1510101798">
     <w:abstractNumId w:val="17"/>
   </w:num>
-  <w:num w:numId="14">
+  <w:num w:numId="14" w16cid:durableId="688262649">
     <w:abstractNumId w:val="7"/>
   </w:num>
-  <w:num w:numId="15">
+  <w:num w:numId="15" w16cid:durableId="1158305349">
     <w:abstractNumId w:val="33"/>
   </w:num>
-  <w:num w:numId="16">
+  <w:num w:numId="16" w16cid:durableId="293295074">
     <w:abstractNumId w:val="2"/>
   </w:num>
-  <w:num w:numId="17">
+  <w:num w:numId="17" w16cid:durableId="287006891">
     <w:abstractNumId w:val="32"/>
   </w:num>
-  <w:num w:numId="18">
+  <w:num w:numId="18" w16cid:durableId="969165793">
     <w:abstractNumId w:val="21"/>
   </w:num>
-  <w:num w:numId="19">
+  <w:num w:numId="19" w16cid:durableId="1049651577">
     <w:abstractNumId w:val="23"/>
   </w:num>
-  <w:num w:numId="20">
+  <w:num w:numId="20" w16cid:durableId="380904742">
     <w:abstractNumId w:val="28"/>
   </w:num>
-  <w:num w:numId="21">
+  <w:num w:numId="21" w16cid:durableId="670984964">
     <w:abstractNumId w:val="24"/>
   </w:num>
-  <w:num w:numId="22">
+  <w:num w:numId="22" w16cid:durableId="2124302476">
     <w:abstractNumId w:val="3"/>
   </w:num>
-  <w:num w:numId="23">
+  <w:num w:numId="23" w16cid:durableId="2135174011">
     <w:abstractNumId w:val="14"/>
   </w:num>
-  <w:num w:numId="24">
+  <w:num w:numId="24" w16cid:durableId="1320575087">
     <w:abstractNumId w:val="0"/>
   </w:num>
-  <w:num w:numId="25">
+  <w:num w:numId="25" w16cid:durableId="435290884">
     <w:abstractNumId w:val="8"/>
   </w:num>
-  <w:num w:numId="26">
+  <w:num w:numId="26" w16cid:durableId="343868117">
     <w:abstractNumId w:val="19"/>
   </w:num>
-  <w:num w:numId="27">
+  <w:num w:numId="27" w16cid:durableId="1106080630">
     <w:abstractNumId w:val="6"/>
   </w:num>
-  <w:num w:numId="28">
+  <w:num w:numId="28" w16cid:durableId="46147150">
     <w:abstractNumId w:val="5"/>
   </w:num>
-  <w:num w:numId="29">
+  <w:num w:numId="29" w16cid:durableId="1754163392">
     <w:abstractNumId w:val="20"/>
   </w:num>
-  <w:num w:numId="30">
+  <w:num w:numId="30" w16cid:durableId="1190531005">
     <w:abstractNumId w:val="29"/>
   </w:num>
-  <w:num w:numId="31">
+  <w:num w:numId="31" w16cid:durableId="1153913750">
     <w:abstractNumId w:val="13"/>
   </w:num>
-  <w:num w:numId="32">
+  <w:num w:numId="32" w16cid:durableId="672076412">
     <w:abstractNumId w:val="30"/>
   </w:num>
-  <w:num w:numId="33">
+  <w:num w:numId="33" w16cid:durableId="902906795">
     <w:abstractNumId w:val="16"/>
   </w:num>
-  <w:num w:numId="34">
+  <w:num w:numId="34" w16cid:durableId="737553673">
     <w:abstractNumId w:val="9"/>
   </w:num>
 </w:numbering>
 </file>
 
 <file path=word/styles.xml><?xml version="1.0" encoding="utf-8"?>
-<w:styles xmlns:mc="http://schemas.openxmlformats.org/markup-compatibility/2006" xmlns:r="http://schemas.openxmlformats.org/officeDocument/2006/relationships" xmlns:w="http://schemas.openxmlformats.org/wordprocessingml/2006/main" xmlns:w14="http://schemas.microsoft.com/office/word/2010/wordml" xmlns:w15="http://schemas.microsoft.com/office/word/2012/wordml" mc:Ignorable="w14 w15">
+<w:styles xmlns:mc="http://schemas.openxmlformats.org/markup-compatibility/2006" xmlns:r="http://schemas.openxmlformats.org/officeDocument/2006/relationships" xmlns:w="http://schemas.openxmlformats.org/wordprocessingml/2006/main" xmlns:w14="http://schemas.microsoft.com/office/word/2010/wordml" xmlns:w15="http://schemas.microsoft.com/office/word/2012/wordml" xmlns:w16cex="http://schemas.microsoft.com/office/word/2018/wordml/cex" xmlns:w16cid="http://schemas.microsoft.com/office/word/2016/wordml/cid" xmlns:w16="http://schemas.microsoft.com/office/word/2018/wordml" xmlns:w16du="http://schemas.microsoft.com/office/word/2023/wordml/word16du" xmlns:w16sdtdh="http://schemas.microsoft.com/office/word/2020/wordml/sdtdatahash" xmlns:w16sdtfl="http://schemas.microsoft.com/office/word/2024/wordml/sdtformatlock" xmlns:w16se="http://schemas.microsoft.com/office/word/2015/wordml/symex" mc:Ignorable="w14 w15 w16se w16cid w16 w16cex w16sdtdh w16sdtfl w16du">
   <w:docDefaults>
     <w:rPrDefault>
       <w:rPr>
@@ -8323,7 +8322,7 @@
       </w:pPr>
     </w:pPrDefault>
   </w:docDefaults>
-  <w:latentStyles w:defLockedState="0" w:defUIPriority="99" w:defSemiHidden="0" w:defUnhideWhenUsed="0" w:defQFormat="0" w:count="371">
+  <w:latentStyles w:defLockedState="0" w:defUIPriority="99" w:defSemiHidden="0" w:defUnhideWhenUsed="0" w:defQFormat="0" w:count="376">
     <w:lsdException w:name="Normal" w:uiPriority="0" w:qFormat="1"/>
     <w:lsdException w:name="heading 1" w:uiPriority="9" w:qFormat="1"/>
     <w:lsdException w:name="heading 2" w:semiHidden="1" w:uiPriority="9" w:unhideWhenUsed="1" w:qFormat="1"/>
@@ -8695,6 +8694,11 @@
     <w:lsdException w:name="List Table 5 Dark Accent 6" w:uiPriority="50"/>
     <w:lsdException w:name="List Table 6 Colorful Accent 6" w:uiPriority="51"/>
     <w:lsdException w:name="List Table 7 Colorful Accent 6" w:uiPriority="52"/>
+    <w:lsdException w:name="Mention" w:semiHidden="1" w:unhideWhenUsed="1"/>
+    <w:lsdException w:name="Smart Hyperlink" w:semiHidden="1" w:unhideWhenUsed="1"/>
+    <w:lsdException w:name="Hashtag" w:semiHidden="1" w:unhideWhenUsed="1"/>
+    <w:lsdException w:name="Unresolved Mention" w:semiHidden="1" w:unhideWhenUsed="1"/>
+    <w:lsdException w:name="Smart Link" w:semiHidden="1" w:unhideWhenUsed="1"/>
   </w:latentStyles>
   <w:style w:type="paragraph" w:default="1" w:styleId="Normal">
     <w:name w:val="Normal"/>
@@ -8800,7 +8804,6 @@
       <w:spacing w:line="240" w:lineRule="auto"/>
     </w:pPr>
     <w:tblPr>
-      <w:tblInd w:w="0" w:type="dxa"/>
       <w:tblBorders>
         <w:top w:val="single" w:sz="4" w:space="0" w:color="auto"/>
         <w:left w:val="single" w:sz="4" w:space="0" w:color="auto"/>
@@ -8809,12 +8812,6 @@
         <w:insideH w:val="single" w:sz="4" w:space="0" w:color="auto"/>
         <w:insideV w:val="single" w:sz="4" w:space="0" w:color="auto"/>
       </w:tblBorders>
-      <w:tblCellMar>
-        <w:top w:w="0" w:type="dxa"/>
-        <w:left w:w="108" w:type="dxa"/>
-        <w:bottom w:w="0" w:type="dxa"/>
-        <w:right w:w="108" w:type="dxa"/>
-      </w:tblCellMar>
     </w:tblPr>
   </w:style>
   <w:style w:type="character" w:styleId="PlaceholderText">
@@ -8999,19 +8996,12 @@
     <w:tblPr>
       <w:tblStyleRowBandSize w:val="1"/>
       <w:tblStyleColBandSize w:val="1"/>
-      <w:tblInd w:w="0" w:type="dxa"/>
       <w:tblBorders>
         <w:top w:val="single" w:sz="4" w:space="0" w:color="000000" w:themeColor="text1"/>
         <w:left w:val="single" w:sz="4" w:space="0" w:color="000000" w:themeColor="text1"/>
         <w:bottom w:val="single" w:sz="4" w:space="0" w:color="000000" w:themeColor="text1"/>
         <w:right w:val="single" w:sz="4" w:space="0" w:color="000000" w:themeColor="text1"/>
       </w:tblBorders>
-      <w:tblCellMar>
-        <w:top w:w="0" w:type="dxa"/>
-        <w:left w:w="108" w:type="dxa"/>
-        <w:bottom w:w="0" w:type="dxa"/>
-        <w:right w:w="108" w:type="dxa"/>
-      </w:tblCellMar>
     </w:tblPr>
     <w:tblStylePr w:type="firstRow">
       <w:rPr>
@@ -9130,7 +9120,6 @@
     <w:tblPr>
       <w:tblStyleRowBandSize w:val="1"/>
       <w:tblStyleColBandSize w:val="1"/>
-      <w:tblInd w:w="0" w:type="dxa"/>
       <w:tblBorders>
         <w:top w:val="single" w:sz="4" w:space="0" w:color="999999" w:themeColor="text1" w:themeTint="66"/>
         <w:left w:val="single" w:sz="4" w:space="0" w:color="999999" w:themeColor="text1" w:themeTint="66"/>
@@ -9139,12 +9128,6 @@
         <w:insideH w:val="single" w:sz="4" w:space="0" w:color="999999" w:themeColor="text1" w:themeTint="66"/>
         <w:insideV w:val="single" w:sz="4" w:space="0" w:color="999999" w:themeColor="text1" w:themeTint="66"/>
       </w:tblBorders>
-      <w:tblCellMar>
-        <w:top w:w="0" w:type="dxa"/>
-        <w:left w:w="108" w:type="dxa"/>
-        <w:bottom w:w="0" w:type="dxa"/>
-        <w:right w:w="108" w:type="dxa"/>
-      </w:tblCellMar>
     </w:tblPr>
     <w:tblStylePr w:type="firstRow">
       <w:rPr>
@@ -9569,6 +9552,12 @@
 </file>
 
 <file path=customXml/item1.xml><?xml version="1.0" encoding="utf-8"?>
+<p:properties xmlns:p="http://schemas.microsoft.com/office/2006/metadata/properties" xmlns:xsi="http://www.w3.org/2001/XMLSchema-instance" xmlns:pc="http://schemas.microsoft.com/office/infopath/2007/PartnerControls">
+  <documentManagement/>
+</p:properties>
+</file>
+
+<file path=customXml/item2.xml><?xml version="1.0" encoding="utf-8"?>
 <ct:contentTypeSchema xmlns:ct="http://schemas.microsoft.com/office/2006/metadata/contentType" xmlns:ma="http://schemas.microsoft.com/office/2006/metadata/properties/metaAttributes" ct:_="" ma:_="" ma:contentTypeName="Document" ma:contentTypeID="0x01010021A59588BC0053418FC88F40861DA871" ma:contentTypeVersion="10" ma:contentTypeDescription="Create a new document." ma:contentTypeScope="" ma:versionID="3673c1cf7550c71788a22a838bb0d9c0">
   <xsd:schema xmlns:xsd="http://www.w3.org/2001/XMLSchema" xmlns:xs="http://www.w3.org/2001/XMLSchema" xmlns:p="http://schemas.microsoft.com/office/2006/metadata/properties" xmlns:ns2="22f4eba5-1bf1-421f-a001-fd7acca9760c" targetNamespace="http://schemas.microsoft.com/office/2006/metadata/properties" ma:root="true" ma:fieldsID="ac330b6bfa0f539d41f40e8181b11b47" ns2:_="">
     <xsd:import namespace="22f4eba5-1bf1-421f-a001-fd7acca9760c"/>
@@ -9752,13 +9741,11 @@
 </ct:contentTypeSchema>
 </file>
 
-<file path=customXml/item2.xml><?xml version="1.0" encoding="utf-8"?>
-<p:properties xmlns:p="http://schemas.microsoft.com/office/2006/metadata/properties" xmlns:xsi="http://www.w3.org/2001/XMLSchema-instance" xmlns:pc="http://schemas.microsoft.com/office/infopath/2007/PartnerControls">
-  <documentManagement/>
-</p:properties>
+<file path=customXml/item3.xml><?xml version="1.0" encoding="utf-8"?>
+<b:Sources xmlns:b="http://schemas.openxmlformats.org/officeDocument/2006/bibliography" xmlns="http://schemas.openxmlformats.org/officeDocument/2006/bibliography" SelectedStyle="\APASixthEditionOfficeOnline.xsl" StyleName="APA" Version="6"/>
 </file>
 
-<file path=customXml/item3.xml><?xml version="1.0" encoding="utf-8"?>
+<file path=customXml/item4.xml><?xml version="1.0" encoding="utf-8"?>
 <?mso-contentType ?>
 <FormTemplates xmlns="http://schemas.microsoft.com/sharepoint/v3/contenttype/forms">
   <Display>DocumentLibraryForm</Display>
@@ -9767,11 +9754,16 @@
 </FormTemplates>
 </file>
 
-<file path=customXml/item4.xml><?xml version="1.0" encoding="utf-8"?>
-<b:Sources xmlns:b="http://schemas.openxmlformats.org/officeDocument/2006/bibliography" xmlns="http://schemas.openxmlformats.org/officeDocument/2006/bibliography" SelectedStyle="\APASixthEditionOfficeOnline.xsl" StyleName="APA" Version="6"/>
+<file path=customXml/itemProps1.xml><?xml version="1.0" encoding="utf-8"?>
+<ds:datastoreItem xmlns:ds="http://schemas.openxmlformats.org/officeDocument/2006/customXml" ds:itemID="{279A32A1-94B8-4C38-AF26-42DBFF0B0D86}">
+  <ds:schemaRefs>
+    <ds:schemaRef ds:uri="http://schemas.microsoft.com/office/2006/metadata/properties"/>
+    <ds:schemaRef ds:uri="http://schemas.microsoft.com/office/infopath/2007/PartnerControls"/>
+  </ds:schemaRefs>
+</ds:datastoreItem>
 </file>
 
-<file path=customXml/itemProps1.xml><?xml version="1.0" encoding="utf-8"?>
+<file path=customXml/itemProps2.xml><?xml version="1.0" encoding="utf-8"?>
 <ds:datastoreItem xmlns:ds="http://schemas.openxmlformats.org/officeDocument/2006/customXml" ds:itemID="{65E5B5D4-677A-455F-8552-96943537CE77}">
   <ds:schemaRefs>
     <ds:schemaRef ds:uri="http://schemas.microsoft.com/office/2006/metadata/contentType"/>
@@ -9789,27 +9781,18 @@
 </ds:datastoreItem>
 </file>
 
-<file path=customXml/itemProps2.xml><?xml version="1.0" encoding="utf-8"?>
-<ds:datastoreItem xmlns:ds="http://schemas.openxmlformats.org/officeDocument/2006/customXml" ds:itemID="{279A32A1-94B8-4C38-AF26-42DBFF0B0D86}">
+<file path=customXml/itemProps3.xml><?xml version="1.0" encoding="utf-8"?>
+<ds:datastoreItem xmlns:ds="http://schemas.openxmlformats.org/officeDocument/2006/customXml" ds:itemID="{F039618D-116C-4598-9531-19F403ED7C79}">
   <ds:schemaRefs>
-    <ds:schemaRef ds:uri="http://schemas.microsoft.com/office/2006/metadata/properties"/>
-    <ds:schemaRef ds:uri="http://schemas.microsoft.com/office/infopath/2007/PartnerControls"/>
+    <ds:schemaRef ds:uri="http://schemas.openxmlformats.org/officeDocument/2006/bibliography"/>
   </ds:schemaRefs>
 </ds:datastoreItem>
 </file>
 
-<file path=customXml/itemProps3.xml><?xml version="1.0" encoding="utf-8"?>
+<file path=customXml/itemProps4.xml><?xml version="1.0" encoding="utf-8"?>
 <ds:datastoreItem xmlns:ds="http://schemas.openxmlformats.org/officeDocument/2006/customXml" ds:itemID="{56C44748-5791-4773-80AF-F953C3055353}">
   <ds:schemaRefs>
     <ds:schemaRef ds:uri="http://schemas.microsoft.com/sharepoint/v3/contenttype/forms"/>
   </ds:schemaRefs>
 </ds:datastoreItem>
-</file>
-
-<file path=customXml/itemProps4.xml><?xml version="1.0" encoding="utf-8"?>
-<ds:datastoreItem xmlns:ds="http://schemas.openxmlformats.org/officeDocument/2006/customXml" ds:itemID="{F039618D-116C-4598-9531-19F403ED7C79}">
-  <ds:schemaRefs>
-    <ds:schemaRef ds:uri="http://schemas.openxmlformats.org/officeDocument/2006/bibliography"/>
-  </ds:schemaRefs>
-</ds:datastoreItem>
 </file>
</xml_diff>